<commit_message>
Turtle - origin description
</commit_message>
<xml_diff>
--- a/05_Schleifen/Übungen/04_stringLoops/Turtle/Turtle.docx
+++ b/05_Schleifen/Übungen/04_stringLoops/Turtle/Turtle.docx
@@ -51,16 +51,11 @@
       <w:r>
         <w:t>Schreibe ein Programm „</w:t>
       </w:r>
-      <w:proofErr w:type="spellStart"/>
       <w:r>
         <w:t>Turtle</w:t>
       </w:r>
       <w:r>
-        <w:t>.cs</w:t>
-      </w:r>
-      <w:proofErr w:type="spellEnd"/>
-      <w:r>
-        <w:t xml:space="preserve">“ </w:t>
+        <w:t xml:space="preserve">.cs“ </w:t>
       </w:r>
       <w:r>
         <w:t>mit dem man eine kleine Schildkröte (das Zeichen ‚*‘) am Bildschirm bewegen kann. Dazu gibt der Benutzer beim Programmstart einen String ein, der die Definition der Bewegung enthält.</w:t>
@@ -270,11 +265,7 @@
         <w:ind w:left="284" w:hanging="284"/>
       </w:pPr>
       <w:r>
-        <w:t xml:space="preserve">‚D‘ (für </w:t>
-      </w:r>
-      <w:proofErr w:type="spellStart"/>
-      <w:r>
-        <w:t>Pen</w:t>
+        <w:t>‚D‘ (für Pen</w:t>
       </w:r>
       <w:r>
         <w:rPr>
@@ -284,11 +275,7 @@
         <w:t>D</w:t>
       </w:r>
       <w:r>
-        <w:t>own</w:t>
-      </w:r>
-      <w:proofErr w:type="spellEnd"/>
-      <w:r>
-        <w:t>) schaltet das Zeichnen eines ‚*‘ nach jedem Kommando ein.</w:t>
+        <w:t>own) schaltet das Zeichnen eines ‚*‘ nach jedem Kommando ein.</w:t>
       </w:r>
     </w:p>
     <w:p>
@@ -302,11 +289,7 @@
         <w:ind w:left="284" w:hanging="284"/>
       </w:pPr>
       <w:r>
-        <w:t xml:space="preserve">‚U‘ (für </w:t>
-      </w:r>
-      <w:proofErr w:type="spellStart"/>
-      <w:r>
-        <w:t>Pen</w:t>
+        <w:t>‚U‘ (für Pen</w:t>
       </w:r>
       <w:r>
         <w:rPr>
@@ -316,11 +299,7 @@
         <w:t>U</w:t>
       </w:r>
       <w:r>
-        <w:t>p</w:t>
-      </w:r>
-      <w:proofErr w:type="spellEnd"/>
-      <w:r>
-        <w:t xml:space="preserve">): </w:t>
+        <w:t xml:space="preserve">p): </w:t>
       </w:r>
       <w:r>
         <w:t>J</w:t>
@@ -349,13 +328,10 @@
         <w:ind w:left="0"/>
       </w:pPr>
       <w:r>
-        <w:t>B</w:t>
-      </w:r>
-      <w:r>
-        <w:t>eispiel</w:t>
-      </w:r>
-      <w:r>
-        <w:t xml:space="preserve"> 1</w:t>
+        <w:t xml:space="preserve">Beispiel </w:t>
+      </w:r>
+      <w:r>
+        <w:t>1</w:t>
       </w:r>
       <w:r>
         <w:t>:</w:t>
@@ -368,22 +344,91 @@
         <w:ind w:left="0"/>
       </w:pPr>
       <w:r>
-        <w:t>Mit der</w:t>
-      </w:r>
-      <w:r>
-        <w:t xml:space="preserve"> Eingabe </w:t>
+        <w:t xml:space="preserve">Mit der Eingabe </w:t>
       </w:r>
       <w:r>
         <w:rPr>
           <w:rFonts w:ascii="Courier New" w:hAnsi="Courier New" w:cs="Courier New"/>
         </w:rPr>
-        <w:t>U1111D01234567</w:t>
-      </w:r>
-      <w:r>
-        <w:t xml:space="preserve"> zeichnet das Programm</w:t>
-      </w:r>
-      <w:r>
-        <w:t xml:space="preserve"> einen Kreis</w:t>
+        <w:t>1111D</w:t>
+      </w:r>
+      <w:r>
+        <w:rPr>
+          <w:rFonts w:ascii="Courier New" w:hAnsi="Courier New" w:cs="Courier New"/>
+        </w:rPr>
+        <w:t>222</w:t>
+      </w:r>
+      <w:r>
+        <w:t xml:space="preserve"> zeichnet das Programm eine</w:t>
+      </w:r>
+      <w:r>
+        <w:t xml:space="preserve"> waagrechte Linie. Mit 1111 geht man vom Ursprung 0.0 (links</w:t>
+      </w:r>
+      <w:r>
+        <w:t>/</w:t>
+      </w:r>
+      <w:r>
+        <w:t>unten) schräg nach oben (</w:t>
+      </w:r>
+      <w:r>
+        <w:t xml:space="preserve">4 mal wegen </w:t>
+      </w:r>
+      <w:r>
+        <w:t>1</w:t>
+      </w:r>
+      <w:r>
+        <w:t>111</w:t>
+      </w:r>
+      <w:r>
+        <w:t>)</w:t>
+      </w:r>
+      <w:r>
+        <w:t xml:space="preserve">, </w:t>
+      </w:r>
+      <w:r>
+        <w:t xml:space="preserve">mit D schaltet man das Zeichnen ein </w:t>
+      </w:r>
+      <w:r>
+        <w:t xml:space="preserve">- </w:t>
+      </w:r>
+      <w:r>
+        <w:t xml:space="preserve">dabei wird schon ein </w:t>
+      </w:r>
+      <w:r>
+        <w:t>‚</w:t>
+      </w:r>
+      <w:r>
+        <w:t>*</w:t>
+      </w:r>
+      <w:r>
+        <w:t>‘</w:t>
+      </w:r>
+      <w:r>
+        <w:t xml:space="preserve"> </w:t>
+      </w:r>
+      <w:r>
+        <w:t>ausgegeben</w:t>
+      </w:r>
+      <w:r>
+        <w:t xml:space="preserve">. 222 zeichnet </w:t>
+      </w:r>
+      <w:r>
+        <w:t xml:space="preserve">dann </w:t>
+      </w:r>
+      <w:r>
+        <w:t xml:space="preserve">weiteren drei ‚*‘ </w:t>
+      </w:r>
+      <w:r>
+        <w:t>d</w:t>
+      </w:r>
+      <w:r>
+        <w:t>er</w:t>
+      </w:r>
+      <w:r>
+        <w:t xml:space="preserve"> </w:t>
+      </w:r>
+      <w:r>
+        <w:t>Linien</w:t>
       </w:r>
       <w:r>
         <w:t>:</w:t>
@@ -394,21 +439,51 @@
         <w:pStyle w:val="Listenabsatz"/>
         <w:spacing w:after="0" w:line="240" w:lineRule="auto"/>
       </w:pPr>
+    </w:p>
+    <w:p>
+      <w:pPr>
+        <w:pStyle w:val="Listenabsatz"/>
+        <w:spacing w:after="0" w:line="240" w:lineRule="auto"/>
+      </w:pPr>
+      <w:r>
+        <w:rPr>
+          <w:rFonts w:ascii="Courier New" w:hAnsi="Courier New" w:cs="Courier New"/>
+        </w:rPr>
+        <w:t>**</w:t>
+      </w:r>
+      <w:r>
+        <w:rPr>
+          <w:rFonts w:ascii="Courier New" w:hAnsi="Courier New" w:cs="Courier New"/>
+        </w:rPr>
+        <w:t>**</w:t>
+      </w:r>
+      <w:r>
+        <w:rPr>
+          <w:rFonts w:ascii="Courier New" w:hAnsi="Courier New" w:cs="Courier New"/>
+        </w:rPr>
+        <w:br/>
+      </w:r>
     </w:p>
     <w:p>
       <w:pPr>
         <w:pStyle w:val="Listenabsatz"/>
         <w:spacing w:after="0" w:line="240" w:lineRule="auto"/>
         <w:ind w:left="0"/>
-        <w:rPr>
-          <w:rFonts w:ascii="Courier New" w:hAnsi="Courier New" w:cs="Courier New"/>
-        </w:rPr>
-      </w:pPr>
-      <w:r>
-        <w:rPr>
-          <w:rFonts w:ascii="Courier New" w:hAnsi="Courier New" w:cs="Courier New"/>
-        </w:rPr>
-        <w:t xml:space="preserve">     **</w:t>
+      </w:pPr>
+      <w:r>
+        <w:t>B</w:t>
+      </w:r>
+      <w:r>
+        <w:t>eispiel</w:t>
+      </w:r>
+      <w:r>
+        <w:t xml:space="preserve"> </w:t>
+      </w:r>
+      <w:r>
+        <w:t>2</w:t>
+      </w:r>
+      <w:r>
+        <w:t>:</w:t>
       </w:r>
     </w:p>
     <w:p>
@@ -416,16 +491,34 @@
         <w:pStyle w:val="Listenabsatz"/>
         <w:spacing w:after="0" w:line="240" w:lineRule="auto"/>
         <w:ind w:left="0"/>
+      </w:pPr>
+      <w:r>
+        <w:t>Mit der</w:t>
+      </w:r>
+      <w:r>
+        <w:t xml:space="preserve"> Eingabe </w:t>
+      </w:r>
+      <w:r>
         <w:rPr>
           <w:rFonts w:ascii="Courier New" w:hAnsi="Courier New" w:cs="Courier New"/>
         </w:rPr>
-      </w:pPr>
-      <w:r>
-        <w:rPr>
-          <w:rFonts w:ascii="Courier New" w:hAnsi="Courier New" w:cs="Courier New"/>
-        </w:rPr>
-        <w:t xml:space="preserve">    *  *</w:t>
-      </w:r>
+        <w:t>U1111D01234567</w:t>
+      </w:r>
+      <w:r>
+        <w:t xml:space="preserve"> zeichnet das Programm</w:t>
+      </w:r>
+      <w:r>
+        <w:t xml:space="preserve"> einen Kreis</w:t>
+      </w:r>
+      <w:r>
+        <w:t>:</w:t>
+      </w:r>
+    </w:p>
+    <w:p>
+      <w:pPr>
+        <w:pStyle w:val="Listenabsatz"/>
+        <w:spacing w:after="0" w:line="240" w:lineRule="auto"/>
+      </w:pPr>
     </w:p>
     <w:p>
       <w:pPr>
@@ -440,7 +533,7 @@
         <w:rPr>
           <w:rFonts w:ascii="Courier New" w:hAnsi="Courier New" w:cs="Courier New"/>
         </w:rPr>
-        <w:t xml:space="preserve">    *  *</w:t>
+        <w:t xml:space="preserve">     **</w:t>
       </w:r>
     </w:p>
     <w:p>
@@ -448,27 +541,15 @@
         <w:pStyle w:val="Listenabsatz"/>
         <w:spacing w:after="0" w:line="240" w:lineRule="auto"/>
         <w:ind w:left="0"/>
-      </w:pPr>
-      <w:r>
         <w:rPr>
           <w:rFonts w:ascii="Courier New" w:hAnsi="Courier New" w:cs="Courier New"/>
         </w:rPr>
-        <w:t xml:space="preserve">     **</w:t>
-      </w:r>
+      </w:pPr>
       <w:r>
         <w:rPr>
           <w:rFonts w:ascii="Courier New" w:hAnsi="Courier New" w:cs="Courier New"/>
         </w:rPr>
-        <w:br/>
-      </w:r>
-      <w:r>
-        <w:rPr>
-          <w:rFonts w:ascii="Courier New" w:hAnsi="Courier New" w:cs="Courier New"/>
-        </w:rPr>
-        <w:br/>
-      </w:r>
-      <w:r>
-        <w:t>Beispiel 2:</w:t>
+        <w:t xml:space="preserve">    *  *</w:t>
       </w:r>
     </w:p>
     <w:p>
@@ -476,41 +557,43 @@
         <w:pStyle w:val="Listenabsatz"/>
         <w:spacing w:after="0" w:line="240" w:lineRule="auto"/>
         <w:ind w:left="0"/>
-      </w:pPr>
-      <w:r>
-        <w:t xml:space="preserve">Diese Eingabe </w:t>
-      </w:r>
-      <w:r>
-        <w:rPr>
-          <w:sz w:val="20"/>
-          <w:szCs w:val="20"/>
-        </w:rPr>
-        <w:t>U11111D0011223344556677U2222222222D0011223344556677U66000D44444U566D222222</w:t>
-      </w:r>
-      <w:r>
-        <w:t xml:space="preserve"> zeichnet ein Gesicht:</w:t>
-      </w:r>
-    </w:p>
-    <w:p>
-      <w:pPr>
-        <w:pStyle w:val="Listenabsatz"/>
-        <w:spacing w:after="0" w:line="240" w:lineRule="auto"/>
-      </w:pPr>
+        <w:rPr>
+          <w:rFonts w:ascii="Courier New" w:hAnsi="Courier New" w:cs="Courier New"/>
+        </w:rPr>
+      </w:pPr>
+      <w:r>
+        <w:rPr>
+          <w:rFonts w:ascii="Courier New" w:hAnsi="Courier New" w:cs="Courier New"/>
+        </w:rPr>
+        <w:t xml:space="preserve">    *  *</w:t>
+      </w:r>
     </w:p>
     <w:p>
       <w:pPr>
         <w:pStyle w:val="Listenabsatz"/>
         <w:spacing w:after="0" w:line="240" w:lineRule="auto"/>
         <w:ind w:left="0"/>
+      </w:pPr>
+      <w:r>
         <w:rPr>
           <w:rFonts w:ascii="Courier New" w:hAnsi="Courier New" w:cs="Courier New"/>
         </w:rPr>
-      </w:pPr>
+        <w:t xml:space="preserve">     **</w:t>
+      </w:r>
       <w:r>
         <w:rPr>
           <w:rFonts w:ascii="Courier New" w:hAnsi="Courier New" w:cs="Courier New"/>
         </w:rPr>
-        <w:t xml:space="preserve">       ***       ***</w:t>
+        <w:br/>
+      </w:r>
+      <w:r>
+        <w:rPr>
+          <w:rFonts w:ascii="Courier New" w:hAnsi="Courier New" w:cs="Courier New"/>
+        </w:rPr>
+        <w:br/>
+      </w:r>
+      <w:r>
+        <w:t>Beispiel 2:</w:t>
       </w:r>
     </w:p>
     <w:p>
@@ -518,16 +601,26 @@
         <w:pStyle w:val="Listenabsatz"/>
         <w:spacing w:after="0" w:line="240" w:lineRule="auto"/>
         <w:ind w:left="0"/>
-        <w:rPr>
-          <w:rFonts w:ascii="Courier New" w:hAnsi="Courier New" w:cs="Courier New"/>
-        </w:rPr>
-      </w:pPr>
-      <w:r>
-        <w:rPr>
-          <w:rFonts w:ascii="Courier New" w:hAnsi="Courier New" w:cs="Courier New"/>
-        </w:rPr>
-        <w:t xml:space="preserve">      *   *  *  *   *</w:t>
-      </w:r>
+      </w:pPr>
+      <w:r>
+        <w:t xml:space="preserve">Diese Eingabe </w:t>
+      </w:r>
+      <w:r>
+        <w:rPr>
+          <w:sz w:val="20"/>
+          <w:szCs w:val="20"/>
+        </w:rPr>
+        <w:t>U11111D0011223344556677U2222222222D0011223344556677U66000D44444U566D222222</w:t>
+      </w:r>
+      <w:r>
+        <w:t xml:space="preserve"> zeichnet ein Gesicht:</w:t>
+      </w:r>
+    </w:p>
+    <w:p>
+      <w:pPr>
+        <w:pStyle w:val="Listenabsatz"/>
+        <w:spacing w:after="0" w:line="240" w:lineRule="auto"/>
+      </w:pPr>
     </w:p>
     <w:p>
       <w:pPr>
@@ -542,7 +635,7 @@
         <w:rPr>
           <w:rFonts w:ascii="Courier New" w:hAnsi="Courier New" w:cs="Courier New"/>
         </w:rPr>
-        <w:t xml:space="preserve">     *     * * *     *</w:t>
+        <w:t xml:space="preserve">       ***       ***</w:t>
       </w:r>
     </w:p>
     <w:p>
@@ -558,7 +651,7 @@
         <w:rPr>
           <w:rFonts w:ascii="Courier New" w:hAnsi="Courier New" w:cs="Courier New"/>
         </w:rPr>
-        <w:t xml:space="preserve">     *     * * *     *</w:t>
+        <w:t xml:space="preserve">      *   *  *  *   *</w:t>
       </w:r>
     </w:p>
     <w:p>
@@ -590,7 +683,7 @@
         <w:rPr>
           <w:rFonts w:ascii="Courier New" w:hAnsi="Courier New" w:cs="Courier New"/>
         </w:rPr>
-        <w:t xml:space="preserve">      *   *  *  *   *</w:t>
+        <w:t xml:space="preserve">     *     * * *     *</w:t>
       </w:r>
     </w:p>
     <w:p>
@@ -606,7 +699,7 @@
         <w:rPr>
           <w:rFonts w:ascii="Courier New" w:hAnsi="Courier New" w:cs="Courier New"/>
         </w:rPr>
-        <w:t xml:space="preserve">       ***   *   ***</w:t>
+        <w:t xml:space="preserve">     *     * * *     *</w:t>
       </w:r>
     </w:p>
     <w:p>
@@ -622,20 +715,53 @@
         <w:rPr>
           <w:rFonts w:ascii="Courier New" w:hAnsi="Courier New" w:cs="Courier New"/>
         </w:rPr>
-        <w:t xml:space="preserve">          *******</w:t>
-      </w:r>
-      <w:r>
-        <w:rPr>
-          <w:rFonts w:ascii="Courier New" w:hAnsi="Courier New" w:cs="Courier New"/>
-        </w:rPr>
-        <w:t xml:space="preserve">  </w:t>
+        <w:t xml:space="preserve">      *   *  *  *   *</w:t>
       </w:r>
     </w:p>
     <w:p>
       <w:pPr>
+        <w:pStyle w:val="Listenabsatz"/>
+        <w:spacing w:after="0" w:line="240" w:lineRule="auto"/>
+        <w:ind w:left="0"/>
+        <w:rPr>
+          <w:rFonts w:ascii="Courier New" w:hAnsi="Courier New" w:cs="Courier New"/>
+        </w:rPr>
+      </w:pPr>
+      <w:r>
+        <w:rPr>
+          <w:rFonts w:ascii="Courier New" w:hAnsi="Courier New" w:cs="Courier New"/>
+        </w:rPr>
+        <w:t xml:space="preserve">       ***   *   ***</w:t>
+      </w:r>
+    </w:p>
+    <w:p>
+      <w:pPr>
+        <w:pStyle w:val="Listenabsatz"/>
+        <w:spacing w:after="0" w:line="240" w:lineRule="auto"/>
+        <w:ind w:left="0"/>
+        <w:rPr>
+          <w:rFonts w:ascii="Courier New" w:hAnsi="Courier New" w:cs="Courier New"/>
+        </w:rPr>
+      </w:pPr>
+      <w:r>
+        <w:rPr>
+          <w:rFonts w:ascii="Courier New" w:hAnsi="Courier New" w:cs="Courier New"/>
+        </w:rPr>
+        <w:t xml:space="preserve">          *******</w:t>
+      </w:r>
+      <w:r>
+        <w:rPr>
+          <w:rFonts w:ascii="Courier New" w:hAnsi="Courier New" w:cs="Courier New"/>
+        </w:rPr>
+        <w:t xml:space="preserve">  </w:t>
+      </w:r>
+    </w:p>
+    <w:p>
+      <w:pPr>
         <w:pStyle w:val="berschrift2"/>
       </w:pPr>
       <w:r>
+        <w:lastRenderedPageBreak/>
         <w:t>Hinweis</w:t>
       </w:r>
       <w:r>
@@ -655,11 +781,7 @@
         <w:spacing w:after="0" w:line="240" w:lineRule="auto"/>
       </w:pPr>
       <w:r>
-        <w:t>Beim Programmstar ist die Schildkröte auf Position 0:0 und es gilt ‚U‘ (</w:t>
-      </w:r>
-      <w:proofErr w:type="spellStart"/>
-      <w:r>
-        <w:t>pen</w:t>
+        <w:t>Beim Programmstar ist die Schildkröte auf Position 0:0 und es gilt ‚U‘ (pen</w:t>
       </w:r>
       <w:r>
         <w:rPr>
@@ -669,11 +791,7 @@
         <w:t>U</w:t>
       </w:r>
       <w:r>
-        <w:t>p</w:t>
-      </w:r>
-      <w:proofErr w:type="spellEnd"/>
-      <w:r>
-        <w:t>)</w:t>
+        <w:t>p)</w:t>
       </w:r>
       <w:r>
         <w:br/>
@@ -694,7 +812,6 @@
         <w:ind w:left="714" w:hanging="357"/>
       </w:pPr>
       <w:r>
-        <w:lastRenderedPageBreak/>
         <w:t xml:space="preserve">Vor dem Zeichnen (vor dem </w:t>
       </w:r>
       <w:r>
@@ -709,7 +826,6 @@
       <w:r>
         <w:br/>
       </w:r>
-      <w:proofErr w:type="spellStart"/>
       <w:r>
         <w:rPr>
           <w:rFonts w:ascii="Cascadia Mono" w:hAnsi="Cascadia Mono" w:cs="Cascadia Mono"/>
@@ -717,9 +833,8 @@
           <w:sz w:val="19"/>
           <w:szCs w:val="19"/>
         </w:rPr>
-        <w:t>Console.SetWindowSize</w:t>
-      </w:r>
-      <w:proofErr w:type="spellEnd"/>
+        <w:t>Console.SetWindowSize(</w:t>
+      </w:r>
       <w:r>
         <w:rPr>
           <w:rFonts w:ascii="Cascadia Mono" w:hAnsi="Cascadia Mono" w:cs="Cascadia Mono"/>
@@ -727,7 +842,7 @@
           <w:sz w:val="19"/>
           <w:szCs w:val="19"/>
         </w:rPr>
-        <w:t>(</w:t>
+        <w:t>80</w:t>
       </w:r>
       <w:r>
         <w:rPr>
@@ -736,7 +851,7 @@
           <w:sz w:val="19"/>
           <w:szCs w:val="19"/>
         </w:rPr>
-        <w:t>80</w:t>
+        <w:t xml:space="preserve">, </w:t>
       </w:r>
       <w:r>
         <w:rPr>
@@ -745,7 +860,7 @@
           <w:sz w:val="19"/>
           <w:szCs w:val="19"/>
         </w:rPr>
-        <w:t xml:space="preserve">, </w:t>
+        <w:t>25</w:t>
       </w:r>
       <w:r>
         <w:rPr>
@@ -754,7 +869,7 @@
           <w:sz w:val="19"/>
           <w:szCs w:val="19"/>
         </w:rPr>
-        <w:t>25</w:t>
+        <w:t>);</w:t>
       </w:r>
       <w:r>
         <w:rPr>
@@ -763,36 +878,8 @@
           <w:sz w:val="19"/>
           <w:szCs w:val="19"/>
         </w:rPr>
-        <w:t>);</w:t>
-      </w:r>
-      <w:r>
-        <w:rPr>
-          <w:rFonts w:ascii="Cascadia Mono" w:hAnsi="Cascadia Mono" w:cs="Cascadia Mono"/>
-          <w:color w:val="000000"/>
-          <w:sz w:val="19"/>
-          <w:szCs w:val="19"/>
-        </w:rPr>
         <w:br/>
-      </w:r>
-      <w:proofErr w:type="spellStart"/>
-      <w:r>
-        <w:rPr>
-          <w:rFonts w:ascii="Cascadia Mono" w:hAnsi="Cascadia Mono" w:cs="Cascadia Mono"/>
-          <w:color w:val="000000"/>
-          <w:sz w:val="19"/>
-          <w:szCs w:val="19"/>
-        </w:rPr>
-        <w:t>Console.Clear</w:t>
-      </w:r>
-      <w:proofErr w:type="spellEnd"/>
-      <w:r>
-        <w:rPr>
-          <w:rFonts w:ascii="Cascadia Mono" w:hAnsi="Cascadia Mono" w:cs="Cascadia Mono"/>
-          <w:color w:val="000000"/>
-          <w:sz w:val="19"/>
-          <w:szCs w:val="19"/>
-        </w:rPr>
-        <w:t>();</w:t>
+        <w:t>Console.Clear();</w:t>
       </w:r>
       <w:r>
         <w:rPr>
@@ -837,7 +924,6 @@
       <w:r>
         <w:br/>
       </w:r>
-      <w:proofErr w:type="spellStart"/>
       <w:r>
         <w:rPr>
           <w:rFonts w:ascii="Cascadia Mono" w:hAnsi="Cascadia Mono" w:cs="Cascadia Mono"/>
@@ -845,9 +931,8 @@
           <w:sz w:val="19"/>
           <w:szCs w:val="19"/>
         </w:rPr>
-        <w:t>Console.SetCursorPosition</w:t>
-      </w:r>
-      <w:proofErr w:type="spellEnd"/>
+        <w:t>Console.SetCursorPosition(</w:t>
+      </w:r>
       <w:r>
         <w:rPr>
           <w:rFonts w:ascii="Cascadia Mono" w:hAnsi="Cascadia Mono" w:cs="Cascadia Mono"/>
@@ -855,7 +940,7 @@
           <w:sz w:val="19"/>
           <w:szCs w:val="19"/>
         </w:rPr>
-        <w:t>(</w:t>
+        <w:t>x</w:t>
       </w:r>
       <w:r>
         <w:rPr>
@@ -864,7 +949,7 @@
           <w:sz w:val="19"/>
           <w:szCs w:val="19"/>
         </w:rPr>
-        <w:t>x</w:t>
+        <w:t>,</w:t>
       </w:r>
       <w:r>
         <w:rPr>
@@ -873,7 +958,7 @@
           <w:sz w:val="19"/>
           <w:szCs w:val="19"/>
         </w:rPr>
-        <w:t>,</w:t>
+        <w:t xml:space="preserve"> y</w:t>
       </w:r>
       <w:r>
         <w:rPr>
@@ -882,7 +967,7 @@
           <w:sz w:val="19"/>
           <w:szCs w:val="19"/>
         </w:rPr>
-        <w:t xml:space="preserve"> y</w:t>
+        <w:t>);</w:t>
       </w:r>
       <w:r>
         <w:rPr>
@@ -891,7 +976,17 @@
           <w:sz w:val="19"/>
           <w:szCs w:val="19"/>
         </w:rPr>
-        <w:t>);</w:t>
+        <w:br/>
+        <w:t>Console.Write(</w:t>
+      </w:r>
+      <w:r>
+        <w:rPr>
+          <w:rFonts w:ascii="Cascadia Mono" w:hAnsi="Cascadia Mono" w:cs="Cascadia Mono"/>
+          <w:color w:val="A31515"/>
+          <w:sz w:val="19"/>
+          <w:szCs w:val="19"/>
+        </w:rPr>
+        <w:t>'*'</w:t>
       </w:r>
       <w:r>
         <w:rPr>
@@ -900,9 +995,8 @@
           <w:sz w:val="19"/>
           <w:szCs w:val="19"/>
         </w:rPr>
-        <w:br/>
-      </w:r>
-      <w:proofErr w:type="spellStart"/>
+        <w:t>);</w:t>
+      </w:r>
       <w:r>
         <w:rPr>
           <w:rFonts w:ascii="Cascadia Mono" w:hAnsi="Cascadia Mono" w:cs="Cascadia Mono"/>
@@ -910,9 +1004,8 @@
           <w:sz w:val="19"/>
           <w:szCs w:val="19"/>
         </w:rPr>
-        <w:t>Console.Write</w:t>
-      </w:r>
-      <w:proofErr w:type="spellEnd"/>
+        <w:br/>
+      </w:r>
       <w:r>
         <w:rPr>
           <w:rFonts w:ascii="Cascadia Mono" w:hAnsi="Cascadia Mono" w:cs="Cascadia Mono"/>
@@ -920,57 +1013,44 @@
           <w:sz w:val="19"/>
           <w:szCs w:val="19"/>
         </w:rPr>
-        <w:t>(</w:t>
-      </w:r>
-      <w:r>
-        <w:rPr>
-          <w:rFonts w:ascii="Cascadia Mono" w:hAnsi="Cascadia Mono" w:cs="Cascadia Mono"/>
-          <w:color w:val="A31515"/>
-          <w:sz w:val="19"/>
-          <w:szCs w:val="19"/>
-        </w:rPr>
-        <w:t>'*'</w:t>
-      </w:r>
-      <w:r>
-        <w:rPr>
-          <w:rFonts w:ascii="Cascadia Mono" w:hAnsi="Cascadia Mono" w:cs="Cascadia Mono"/>
-          <w:color w:val="000000"/>
-          <w:sz w:val="19"/>
-          <w:szCs w:val="19"/>
-        </w:rPr>
-        <w:t>);</w:t>
-      </w:r>
-      <w:r>
-        <w:rPr>
-          <w:rFonts w:ascii="Cascadia Mono" w:hAnsi="Cascadia Mono" w:cs="Cascadia Mono"/>
-          <w:color w:val="000000"/>
-          <w:sz w:val="19"/>
-          <w:szCs w:val="19"/>
-        </w:rPr>
         <w:br/>
       </w:r>
       <w:r>
-        <w:rPr>
-          <w:rFonts w:ascii="Cascadia Mono" w:hAnsi="Cascadia Mono" w:cs="Cascadia Mono"/>
-          <w:color w:val="000000"/>
-          <w:sz w:val="19"/>
-          <w:szCs w:val="19"/>
-        </w:rPr>
+        <w:t>ACHTUNG: Der Ausgangspunkt 0:0 ist links</w:t>
+      </w:r>
+      <w:r>
+        <w:t>/</w:t>
+      </w:r>
+      <w:r>
+        <w:t>unten.</w:t>
+      </w:r>
+      <w:r>
         <w:br/>
-      </w:r>
-      <w:r>
-        <w:t>D</w:t>
-      </w:r>
-      <w:r>
-        <w:t xml:space="preserve">ie </w:t>
-      </w:r>
-      <w:proofErr w:type="gramStart"/>
-      <w:r>
-        <w:t>Y Achse</w:t>
-      </w:r>
-      <w:proofErr w:type="gramEnd"/>
-      <w:r>
-        <w:t xml:space="preserve"> wächst nach unten. Man kann diese „</w:t>
+        <w:t xml:space="preserve">Beim Aufruf von </w:t>
+      </w:r>
+      <w:r>
+        <w:rPr>
+          <w:rFonts w:ascii="Courier New" w:hAnsi="Courier New" w:cs="Courier New"/>
+        </w:rPr>
+        <w:t>SetCursorPosition</w:t>
+      </w:r>
+      <w:r>
+        <w:t xml:space="preserve"> wächst aber d</w:t>
+      </w:r>
+      <w:r>
+        <w:t>ie Y Achse nach unten</w:t>
+      </w:r>
+      <w:r>
+        <w:t xml:space="preserve"> (0:0 ist rechts</w:t>
+      </w:r>
+      <w:r>
+        <w:t>/</w:t>
+      </w:r>
+      <w:r>
+        <w:t>oben)</w:t>
+      </w:r>
+      <w:r>
+        <w:t>. Man kann diese „</w:t>
       </w:r>
       <w:r>
         <w:t>Spiegeln</w:t>
@@ -980,15 +1060,7 @@
       </w:r>
       <w:r>
         <w:br/>
-        <w:t xml:space="preserve">(25 ist die Maximalgröße, -1 weil man die Position ab 0 angibt und y im Wertebereich </w:t>
-      </w:r>
-      <w:proofErr w:type="gramStart"/>
-      <w:r>
-        <w:t>0..</w:t>
-      </w:r>
-      <w:proofErr w:type="gramEnd"/>
-      <w:r>
-        <w:t xml:space="preserve">24 sein darf) </w:t>
+        <w:t xml:space="preserve">(25 ist die Maximalgröße, -1 weil man die Position ab 0 angibt und y im Wertebereich 0..24 sein darf) </w:t>
       </w:r>
       <w:r>
         <w:br/>
@@ -1027,7 +1099,6 @@
       <w:r>
         <w:br/>
       </w:r>
-      <w:proofErr w:type="spellStart"/>
       <w:r>
         <w:rPr>
           <w:rFonts w:ascii="Cascadia Mono" w:hAnsi="Cascadia Mono" w:cs="Cascadia Mono"/>
@@ -1035,9 +1106,8 @@
           <w:sz w:val="19"/>
           <w:szCs w:val="19"/>
         </w:rPr>
-        <w:t>Console.SetCursorPosition</w:t>
-      </w:r>
-      <w:proofErr w:type="spellEnd"/>
+        <w:t>Console.SetCursorPosition(</w:t>
+      </w:r>
       <w:r>
         <w:rPr>
           <w:rFonts w:ascii="Cascadia Mono" w:hAnsi="Cascadia Mono" w:cs="Cascadia Mono"/>
@@ -1045,7 +1115,7 @@
           <w:sz w:val="19"/>
           <w:szCs w:val="19"/>
         </w:rPr>
-        <w:t>(</w:t>
+        <w:t>0</w:t>
       </w:r>
       <w:r>
         <w:rPr>
@@ -1054,7 +1124,7 @@
           <w:sz w:val="19"/>
           <w:szCs w:val="19"/>
         </w:rPr>
-        <w:t>0</w:t>
+        <w:t>,</w:t>
       </w:r>
       <w:r>
         <w:rPr>
@@ -1063,7 +1133,7 @@
           <w:sz w:val="19"/>
           <w:szCs w:val="19"/>
         </w:rPr>
-        <w:t>,</w:t>
+        <w:t xml:space="preserve"> 24</w:t>
       </w:r>
       <w:r>
         <w:rPr>
@@ -1072,7 +1142,7 @@
           <w:sz w:val="19"/>
           <w:szCs w:val="19"/>
         </w:rPr>
-        <w:t xml:space="preserve"> 24</w:t>
+        <w:t>);</w:t>
       </w:r>
       <w:r>
         <w:rPr>
@@ -1081,7 +1151,8 @@
           <w:sz w:val="19"/>
           <w:szCs w:val="19"/>
         </w:rPr>
-        <w:t>);</w:t>
+        <w:br/>
+        <w:t>Console.Write</w:t>
       </w:r>
       <w:r>
         <w:rPr>
@@ -1090,28 +1161,8 @@
           <w:sz w:val="19"/>
           <w:szCs w:val="19"/>
         </w:rPr>
-        <w:br/>
-      </w:r>
-      <w:proofErr w:type="spellStart"/>
-      <w:r>
-        <w:rPr>
-          <w:rFonts w:ascii="Cascadia Mono" w:hAnsi="Cascadia Mono" w:cs="Cascadia Mono"/>
-          <w:color w:val="000000"/>
-          <w:sz w:val="19"/>
-          <w:szCs w:val="19"/>
-        </w:rPr>
-        <w:t>Console.Write</w:t>
-      </w:r>
-      <w:r>
-        <w:rPr>
-          <w:rFonts w:ascii="Cascadia Mono" w:hAnsi="Cascadia Mono" w:cs="Cascadia Mono"/>
-          <w:color w:val="000000"/>
-          <w:sz w:val="19"/>
-          <w:szCs w:val="19"/>
-        </w:rPr>
         <w:t>Line</w:t>
       </w:r>
-      <w:proofErr w:type="spellEnd"/>
       <w:r>
         <w:rPr>
           <w:rFonts w:ascii="Cascadia Mono" w:hAnsi="Cascadia Mono" w:cs="Cascadia Mono"/>
@@ -1156,15 +1207,7 @@
       </w:r>
       <w:r>
         <w:br/>
-        <w:t xml:space="preserve">Ignoriere Anweisungen, die eine ungültige Position ergeben (x: </w:t>
-      </w:r>
-      <w:proofErr w:type="gramStart"/>
-      <w:r>
-        <w:t>0..</w:t>
-      </w:r>
-      <w:proofErr w:type="gramEnd"/>
-      <w:r>
-        <w:t>79, y: 0..24)</w:t>
+        <w:t>Ignoriere Anweisungen, die eine ungültige Position ergeben (x: 0..79, y: 0..24)</w:t>
       </w:r>
     </w:p>
     <w:p>
@@ -1211,14 +1254,7 @@
       </w:r>
       <w:r>
         <w:br/>
-      </w:r>
-      <w:proofErr w:type="gramStart"/>
-      <w:r>
-        <w:t>Gibt</w:t>
-      </w:r>
-      <w:proofErr w:type="gramEnd"/>
-      <w:r>
-        <w:t xml:space="preserve"> der Benutzer z.B. $1 ein, wird wie in Beispiel 1 ein Kreis gezeichnet.</w:t>
+        <w:t>Gibt der Benutzer z.B. $1 ein, wird wie in Beispiel 1 ein Kreis gezeichnet.</w:t>
       </w:r>
     </w:p>
     <w:p/>

</xml_diff>